<commit_message>
Google Trends display, CamelCamelCamel links, edge function source, process doc backlog
</commit_message>
<xml_diff>
--- a/praperty-next/praperty-process-doc.docx
+++ b/praperty-next/praperty-process-doc.docx
@@ -2198,6 +2198,314 @@
       </w:r>
       <w:r>
         <w:t xml:space="preserve">Live eBay pricing, expandable categories, trending indicators</w:t>
+      </w:r>
+    </w:p>
+    <w:p>
+      <w:pPr>
+        <w:pStyle w:val="ListParagraph"/>
+        <w:numPr>
+          <w:ilvl w:val="0"/>
+          <w:numId w:val="2"/>
+        </w:numPr>
+      </w:pPr>
+      <w:r>
+        <w:rPr>
+          <w:b/>
+          <w:bCs/>
+        </w:rPr>
+        <w:t xml:space="preserve">Signal Transparency: </w:t>
+      </w:r>
+      <w:r>
+        <w:t xml:space="preserve">Conviction scores visible, signal breakdown on detail screen, research/inventory parity</w:t>
+      </w:r>
+    </w:p>
+    <w:p>
+      <w:pPr>
+        <w:pStyle w:val="ListParagraph"/>
+        <w:numPr>
+          <w:ilvl w:val="0"/>
+          <w:numId w:val="2"/>
+        </w:numPr>
+      </w:pPr>
+      <w:r>
+        <w:rPr>
+          <w:b/>
+          <w:bCs/>
+        </w:rPr>
+        <w:t xml:space="preserve">Watchlist Upgrade: </w:t>
+      </w:r>
+      <w:r>
+        <w:t xml:space="preserve">Live eBay data on watchlist items, price refresh, market signal integration</w:t>
+      </w:r>
+    </w:p>
+    <w:p>
+      <w:pPr>
+        <w:pStyle w:val="ListParagraph"/>
+        <w:numPr>
+          <w:ilvl w:val="0"/>
+          <w:numId w:val="2"/>
+        </w:numPr>
+      </w:pPr>
+      <w:r>
+        <w:rPr>
+          <w:b/>
+          <w:bCs/>
+        </w:rPr>
+        <w:t xml:space="preserve">eBay Intelligence Upgrade: </w:t>
+      </w:r>
+      <w:r>
+        <w:t xml:space="preserve">Edge function v2 with fieldgroups/filter/sort, 4-call parallel intelligence, MarketIntel component with price range + condition breakdown + seller quality</w:t>
+      </w:r>
+    </w:p>
+    <w:p>
+      <w:pPr>
+        <w:pStyle w:val="ListParagraph"/>
+        <w:numPr>
+          <w:ilvl w:val="0"/>
+          <w:numId w:val="2"/>
+        </w:numPr>
+      </w:pPr>
+      <w:r>
+        <w:rPr>
+          <w:b/>
+          <w:bCs/>
+        </w:rPr>
+        <w:t xml:space="preserve">Google Trends Display: </w:t>
+      </w:r>
+      <w:r>
+        <w:t xml:space="preserve">TrendIndicator component with score gauge, direction indicator (rising/stable/declining), wired into detail + research screens</w:t>
+      </w:r>
+    </w:p>
+    <w:p>
+      <w:pPr>
+        <w:pStyle w:val="ListParagraph"/>
+        <w:numPr>
+          <w:ilvl w:val="0"/>
+          <w:numId w:val="2"/>
+        </w:numPr>
+      </w:pPr>
+      <w:r>
+        <w:rPr>
+          <w:b/>
+          <w:bCs/>
+        </w:rPr>
+        <w:t xml:space="preserve">Price Tools Links: </w:t>
+      </w:r>
+      <w:r>
+        <w:t xml:space="preserve">CamelCamelCamel + PriceCharting + Google Trends external links on detail screen for free price history research</w:t>
+      </w:r>
+    </w:p>
+    <w:p>
+      <w:r>
+        <w:br w:type="page"/>
+      </w:r>
+    </w:p>
+    <w:p>
+      <w:pPr>
+        <w:pStyle w:val="Heading1"/>
+      </w:pPr>
+      <w:r>
+        <w:t xml:space="preserve">Deferred / Scale Backlog</w:t>
+      </w:r>
+    </w:p>
+    <w:p>
+      <w:pPr>
+        <w:spacing w:after="100"/>
+      </w:pPr>
+      <w:r>
+        <w:rPr>
+          <w:i/>
+          <w:iCs/>
+          <w:color w:val="888888"/>
+          <w:sz w:val="20"/>
+          <w:szCs w:val="20"/>
+        </w:rPr>
+        <w:t xml:space="preserve">Items parked for later. Revisit when inventory grows past ~50 items or when daily automated data is needed.</w:t>
+      </w:r>
+    </w:p>
+    <w:p>
+      <w:pPr>
+        <w:pBdr>
+          <w:bottom w:val="single" w:color="EB9C35" w:sz="6"/>
+        </w:pBdr>
+        <w:spacing w:after="200"/>
+      </w:pPr>
+    </w:p>
+    <w:p>
+      <w:pPr>
+        <w:pStyle w:val="Heading2"/>
+      </w:pPr>
+      <w:r>
+        <w:t xml:space="preserve">1. Refactor Price History into Dedicated Table</w:t>
+      </w:r>
+    </w:p>
+    <w:p>
+      <w:pPr>
+        <w:spacing w:after="60"/>
+      </w:pPr>
+      <w:r>
+        <w:rPr>
+          <w:b/>
+          <w:bCs/>
+          <w:color w:val="EB9C35"/>
+        </w:rPr>
+        <w:t xml:space="preserve">Why: </w:t>
+      </w:r>
+      <w:r>
+        <w:t xml:space="preserve">Currently price history is stored as a JSON blob inside the items table (capped at 90 days). This works fine for small inventories but will bloat row sizes and slow queries as items grow. A separate price_snapshots table with (item_id, date, source, price) enables time-series queries, aggregation, and indexing.</w:t>
+      </w:r>
+    </w:p>
+    <w:p>
+      <w:pPr>
+        <w:spacing w:after="60"/>
+      </w:pPr>
+      <w:r>
+        <w:rPr>
+          <w:b/>
+          <w:bCs/>
+          <w:color w:val="EB9C35"/>
+        </w:rPr>
+        <w:t xml:space="preserve">Trigger: </w:t>
+      </w:r>
+      <w:r>
+        <w:t xml:space="preserve">When inventory exceeds ~50 items or when price history needs to go beyond 90 days.</w:t>
+      </w:r>
+    </w:p>
+    <w:p>
+      <w:pPr>
+        <w:spacing w:after="100"/>
+      </w:pPr>
+      <w:r>
+        <w:rPr>
+          <w:b/>
+          <w:bCs/>
+          <w:color w:val="EB9C35"/>
+        </w:rPr>
+        <w:t xml:space="preserve">Scope: </w:t>
+      </w:r>
+      <w:r>
+        <w:t xml:space="preserve">New Supabase table, migration script to extract existing JSON blobs, update API routes to read/write from new table, update PriceHistoryChart component.</w:t>
+      </w:r>
+    </w:p>
+    <w:p>
+      <w:pPr>
+        <w:pStyle w:val="Heading2"/>
+      </w:pPr>
+      <w:r>
+        <w:t xml:space="preserve">2. Daily Cron for Automated Price Snapshots</w:t>
+      </w:r>
+    </w:p>
+    <w:p>
+      <w:pPr>
+        <w:spacing w:after="60"/>
+      </w:pPr>
+      <w:r>
+        <w:rPr>
+          <w:b/>
+          <w:bCs/>
+          <w:color w:val="EB9C35"/>
+        </w:rPr>
+        <w:t xml:space="preserve">Why: </w:t>
+      </w:r>
+      <w:r>
+        <w:t xml:space="preserve">Right now all market data refreshes are client-triggered (user opens app). A daily cron would capture price snapshots for every inventory item automatically, building a true time-series dataset. This powers velocity calculations, trend detection, and alert triggers without requiring the user to open the app.</w:t>
+      </w:r>
+    </w:p>
+    <w:p>
+      <w:pPr>
+        <w:spacing w:after="60"/>
+      </w:pPr>
+      <w:r>
+        <w:rPr>
+          <w:b/>
+          <w:bCs/>
+          <w:color w:val="EB9C35"/>
+        </w:rPr>
+        <w:t xml:space="preserve">Trigger: </w:t>
+      </w:r>
+      <w:r>
+        <w:t xml:space="preserve">After price history table refactor is complete. Also depends on eBay API rate limits (currently 5,000 calls/day on Browse API).</w:t>
+      </w:r>
+    </w:p>
+    <w:p>
+      <w:pPr>
+        <w:spacing w:after="100"/>
+      </w:pPr>
+      <w:r>
+        <w:rPr>
+          <w:b/>
+          <w:bCs/>
+          <w:color w:val="EB9C35"/>
+        </w:rPr>
+        <w:t xml:space="preserve">Scope: </w:t>
+      </w:r>
+      <w:r>
+        <w:t xml:space="preserve">Supabase scheduled edge function (pg_cron or external scheduler), batch eBay Browse API calls across all active inventory, write to price_snapshots table, error handling for rate limits.</w:t>
+      </w:r>
+    </w:p>
+    <w:p>
+      <w:pPr>
+        <w:pStyle w:val="Heading2"/>
+      </w:pPr>
+      <w:r>
+        <w:t xml:space="preserve">3. Other Deferred Items</w:t>
+      </w:r>
+    </w:p>
+    <w:p>
+      <w:pPr>
+        <w:pStyle w:val="ListParagraph"/>
+        <w:numPr>
+          <w:ilvl w:val="0"/>
+          <w:numId w:val="2"/>
+        </w:numPr>
+      </w:pPr>
+      <w:r>
+        <w:rPr>
+          <w:b/>
+          <w:bCs/>
+        </w:rPr>
+        <w:t xml:space="preserve">Emoji replacement: </w:t>
+      </w:r>
+      <w:r>
+        <w:t xml:space="preserve">Replace emoji characters in UI with Lucide icons for consistency across platforms</w:t>
+      </w:r>
+    </w:p>
+    <w:p>
+      <w:pPr>
+        <w:pStyle w:val="ListParagraph"/>
+        <w:numPr>
+          <w:ilvl w:val="0"/>
+          <w:numId w:val="2"/>
+        </w:numPr>
+      </w:pPr>
+      <w:r>
+        <w:rPr>
+          <w:b/>
+          <w:bCs/>
+        </w:rPr>
+        <w:t xml:space="preserve">Watchlist live data verification: </w:t>
+      </w:r>
+      <w:r>
+        <w:t xml:space="preserve">Test watchlist with live eBay data on actual phone to verify layout and performance</w:t>
+      </w:r>
+    </w:p>
+    <w:p>
+      <w:pPr>
+        <w:pStyle w:val="ListParagraph"/>
+        <w:numPr>
+          <w:ilvl w:val="0"/>
+          <w:numId w:val="2"/>
+        </w:numPr>
+      </w:pPr>
+      <w:r>
+        <w:rPr>
+          <w:b/>
+          <w:bCs/>
+        </w:rPr>
+        <w:t xml:space="preserve">Market signal caching: </w:t>
+      </w:r>
+      <w:r>
+        <w:t xml:space="preserve">Currently market_signals table overwrites per refresh. Consider TTL-based caching or daily snapshots for historical market context.</w:t>
       </w:r>
     </w:p>
     <w:sectPr>

</xml_diff>